<commit_message>
Replace notification modal with custom panel
Replace the Bootstrap modal in the admin doc fragment with a custom fixed-position notification panel (prevents the gray full-screen backdrop). Add backdrop and close-X handlers, show/hide helpers, and update the submit flow to open the panel for specific doc types and set the sendNotify field before submitting. Also includes updates to several .docx templates/uploads and adds new position docx files under uploads/academic/position/1.
</commit_message>
<xml_diff>
--- a/HRCP-KKU-Academic/uploads/academic/1/doc_2.docx
+++ b/HRCP-KKU-Academic/uploads/academic/1/doc_2.docx
@@ -4,7 +4,7 @@
   <w:body>
     <w:tbl>
       <w:tblPr>
-        <w:tblStyle w:val="TableGrid"/>
+        <w:tblStyle w:val="ae"/>
         <w:tblW w:w="9990" w:type="dxa"/>
         <w:tblInd w:w="-185" w:type="dxa"/>
         <w:tblLook w:val="04A0" w:firstRow="1" w:lastRow="0" w:firstColumn="1" w:lastColumn="0" w:noHBand="0" w:noVBand="1"/>
@@ -128,11 +128,59 @@
             </w:pPr>
             <w:r>
               <w:rPr>
-                <w:rFonts w:ascii="TH Sarabun New" w:hAnsi="TH Sarabun New" w:cs="TH Sarabun New" w:eastAsia="TH Sarabun New"/>
-                <w:sz w:val="28"/>
-                <w:b w:val="off"/>
-              </w:rPr>
-              <w:t xml:space="preserve">(  ✓ )  เพื่อโปรดพิจารณา </w:t>
+                <w:rFonts w:ascii="TH Sarabun New" w:eastAsia="Times New Roman" w:hAnsi="TH Sarabun New" w:cs="TH Sarabun New" w:hint="cs"/>
+                <w:sz w:val="28"/>
+                <w:szCs w:val="28"/>
+                <w:cs/>
+                <w:lang w:val="en-US" w:eastAsia="en-GB"/>
+              </w:rPr>
+              <w:t xml:space="preserve">(  </w:t>
+            </w:r>
+            <w:r>
+              <w:rPr>
+                <w:rFonts w:ascii="TH Sarabun New" w:eastAsia="Times New Roman" w:hAnsi="TH Sarabun New" w:cs="TH Sarabun New"/>
+                <w:sz w:val="28"/>
+                <w:szCs w:val="28"/>
+                <w:lang w:val="en-US" w:eastAsia="en-GB"/>
+              </w:rPr>
+              <w:t/>
+            </w:r>
+            <w:r>
+              <w:rPr>
+                <w:rFonts w:ascii="TH Sarabun New" w:eastAsia="Times New Roman" w:hAnsi="TH Sarabun New" w:cs="TH Sarabun New"/>
+                <w:sz w:val="28"/>
+                <w:szCs w:val="28"/>
+                <w:lang w:eastAsia="en-GB"/>
+              </w:rPr>
+              <w:t/>
+            </w:r>
+            <w:r>
+              <w:rPr>
+                <w:rFonts w:ascii="TH Sarabun New" w:eastAsia="Times New Roman" w:hAnsi="TH Sarabun New" w:cs="TH Sarabun New"/>
+                <w:sz w:val="28"/>
+                <w:szCs w:val="28"/>
+                <w:lang w:eastAsia="en-GB"/>
+              </w:rPr>
+              <w:t/>
+            </w:r>
+            <w:r>
+              <w:rPr>
+                <w:rFonts w:ascii="TH Sarabun New" w:eastAsia="Times New Roman" w:hAnsi="TH Sarabun New" w:cs="TH Sarabun New"/>
+                <w:sz w:val="28"/>
+                <w:szCs w:val="28"/>
+                <w:lang w:val="en-US" w:eastAsia="en-GB"/>
+              </w:rPr>
+              <w:t/>
+            </w:r>
+            <w:r>
+              <w:rPr>
+                <w:rFonts w:ascii="TH Sarabun New" w:eastAsia="Times New Roman" w:hAnsi="TH Sarabun New" w:cs="TH Sarabun New" w:hint="cs"/>
+                <w:sz w:val="28"/>
+                <w:szCs w:val="28"/>
+                <w:cs/>
+                <w:lang w:val="en-US" w:eastAsia="en-GB"/>
+              </w:rPr>
+              <w:t xml:space="preserve"> )  เพื่อโปรดพิจารณา </w:t>
             </w:r>
           </w:p>
           <w:p>
@@ -176,15 +224,63 @@
                 <w:lang w:val="en-US" w:eastAsia="en-GB"/>
               </w:rPr>
             </w:pPr>
+            <w:r>
+              <w:rPr>
+                <w:rFonts w:ascii="TH Sarabun New" w:eastAsia="Times New Roman" w:hAnsi="TH Sarabun New" w:cs="TH Sarabun New" w:hint="cs"/>
+                <w:sz w:val="28"/>
+                <w:szCs w:val="28"/>
+                <w:cs/>
+                <w:lang w:val="en-US" w:eastAsia="en-GB"/>
+              </w:rPr>
+              <w:t>(</w:t>
+            </w:r>
+            <w:r>
+              <w:rPr>
+                <w:rFonts w:ascii="TH Sarabun New" w:eastAsia="Times New Roman" w:hAnsi="TH Sarabun New" w:cs="TH Sarabun New"/>
+                <w:sz w:val="28"/>
+                <w:szCs w:val="28"/>
+                <w:lang w:val="en-US" w:eastAsia="en-GB"/>
+              </w:rPr>
+              <w:t/>
+            </w:r>
             <w:proofErr w:type="spellStart"/>
+            <w:r>
+              <w:rPr>
+                <w:rFonts w:ascii="TH Sarabun New" w:eastAsia="Times New Roman" w:hAnsi="TH Sarabun New" w:cs="TH Sarabun New"/>
+                <w:sz w:val="28"/>
+                <w:szCs w:val="28"/>
+                <w:lang w:val="en-US" w:eastAsia="en-GB"/>
+              </w:rPr>
+              <w:t/>
+            </w:r>
+            <w:r>
+              <w:rPr>
+                <w:rFonts w:ascii="TH Sarabun New" w:eastAsia="Times New Roman" w:hAnsi="TH Sarabun New" w:cs="TH Sarabun New"/>
+                <w:sz w:val="28"/>
+                <w:szCs w:val="28"/>
+                <w:lang w:val="en-US" w:eastAsia="en-GB"/>
+              </w:rPr>
+              <w:t/>
+            </w:r>
             <w:proofErr w:type="spellEnd"/>
             <w:r>
               <w:rPr>
-                <w:rFonts w:ascii="TH Sarabun New" w:hAnsi="TH Sarabun New" w:cs="TH Sarabun New" w:eastAsia="TH Sarabun New"/>
-                <w:sz w:val="28"/>
-                <w:b w:val="off"/>
-              </w:rPr>
-              <w:t>(ssssssssssssssssssssss)</w:t>
+                <w:rFonts w:ascii="TH Sarabun New" w:eastAsia="Times New Roman" w:hAnsi="TH Sarabun New" w:cs="TH Sarabun New"/>
+                <w:sz w:val="28"/>
+                <w:szCs w:val="28"/>
+                <w:lang w:val="en-US" w:eastAsia="en-GB"/>
+              </w:rPr>
+              <w:t/>
+            </w:r>
+            <w:r>
+              <w:rPr>
+                <w:rFonts w:ascii="TH Sarabun New" w:eastAsia="Times New Roman" w:hAnsi="TH Sarabun New" w:cs="TH Sarabun New" w:hint="cs"/>
+                <w:sz w:val="28"/>
+                <w:szCs w:val="28"/>
+                <w:cs/>
+                <w:lang w:val="en-US" w:eastAsia="en-GB"/>
+              </w:rPr>
+              <w:t>)</w:t>
             </w:r>
           </w:p>
           <w:p>
@@ -199,15 +295,52 @@
                 <w:lang w:val="en-US" w:eastAsia="en-GB"/>
               </w:rPr>
             </w:pPr>
+            <w:r>
+              <w:rPr>
+                <w:rFonts w:ascii="TH Sarabun New" w:eastAsia="Times New Roman" w:hAnsi="TH Sarabun New" w:cs="TH Sarabun New"/>
+                <w:sz w:val="28"/>
+                <w:szCs w:val="28"/>
+                <w:lang w:val="en-US" w:eastAsia="en-GB"/>
+              </w:rPr>
+              <w:t>รองคณบดีวิทยาลัยการคอมพิวเตอร์</w:t>
+            </w:r>
             <w:proofErr w:type="spellStart"/>
+            <w:r>
+              <w:rPr>
+                <w:rFonts w:ascii="TH Sarabun New" w:eastAsia="Times New Roman" w:hAnsi="TH Sarabun New" w:cs="TH Sarabun New"/>
+                <w:sz w:val="28"/>
+                <w:szCs w:val="28"/>
+                <w:lang w:eastAsia="en-GB"/>
+              </w:rPr>
+              <w:t/>
+            </w:r>
+            <w:r>
+              <w:rPr>
+                <w:rFonts w:ascii="TH Sarabun New" w:eastAsia="Times New Roman" w:hAnsi="TH Sarabun New" w:cs="TH Sarabun New"/>
+                <w:sz w:val="28"/>
+                <w:szCs w:val="28"/>
+                <w:lang w:eastAsia="en-GB"/>
+              </w:rPr>
+              <w:t/>
+            </w:r>
+            <w:r>
+              <w:rPr>
+                <w:rFonts w:ascii="TH Sarabun New" w:eastAsia="Times New Roman" w:hAnsi="TH Sarabun New" w:cs="TH Sarabun New"/>
+                <w:sz w:val="28"/>
+                <w:szCs w:val="28"/>
+                <w:lang w:eastAsia="en-GB"/>
+              </w:rPr>
+              <w:t/>
+            </w:r>
             <w:proofErr w:type="spellEnd"/>
             <w:r>
               <w:rPr>
-                <w:rFonts w:ascii="TH Sarabun New" w:hAnsi="TH Sarabun New" w:cs="TH Sarabun New" w:eastAsia="TH Sarabun New"/>
-                <w:sz w:val="28"/>
-                <w:b w:val="off"/>
-              </w:rPr>
-              <w:t>คณบดีวิทยาลัยการคอมพิวเตอร์</w:t>
+                <w:rFonts w:ascii="TH Sarabun New" w:eastAsia="Times New Roman" w:hAnsi="TH Sarabun New" w:cs="TH Sarabun New"/>
+                <w:sz w:val="28"/>
+                <w:szCs w:val="28"/>
+                <w:lang w:val="en-US" w:eastAsia="en-GB"/>
+              </w:rPr>
+              <w:t/>
             </w:r>
           </w:p>
         </w:tc>
@@ -224,15 +357,54 @@
                 <w:lang w:val="en-US" w:eastAsia="en-GB"/>
               </w:rPr>
             </w:pPr>
+            <w:r>
+              <w:rPr>
+                <w:rFonts w:ascii="TH Sarabun New" w:eastAsia="Times New Roman" w:hAnsi="TH Sarabun New" w:cs="TH Sarabun New" w:hint="cs"/>
+                <w:sz w:val="28"/>
+                <w:szCs w:val="28"/>
+                <w:cs/>
+                <w:lang w:val="en-US" w:eastAsia="en-GB"/>
+              </w:rPr>
+              <w:t xml:space="preserve">(  </w:t>
+            </w:r>
+            <w:r>
+              <w:rPr>
+                <w:rFonts w:ascii="TH Sarabun New" w:eastAsia="Times New Roman" w:hAnsi="TH Sarabun New" w:cs="TH Sarabun New"/>
+                <w:sz w:val="28"/>
+                <w:szCs w:val="28"/>
+                <w:lang w:val="en-US" w:eastAsia="en-GB"/>
+              </w:rPr>
+              <w:t/>
+            </w:r>
             <w:proofErr w:type="spellStart"/>
+            <w:r>
+              <w:rPr>
+                <w:rFonts w:ascii="TH Sarabun New" w:eastAsia="Times New Roman" w:hAnsi="TH Sarabun New" w:cs="TH Sarabun New"/>
+                <w:sz w:val="28"/>
+                <w:szCs w:val="28"/>
+                <w:lang w:eastAsia="en-GB"/>
+              </w:rPr>
+              <w:t/>
+            </w:r>
             <w:proofErr w:type="spellEnd"/>
             <w:r>
               <w:rPr>
-                <w:rFonts w:ascii="TH Sarabun New" w:hAnsi="TH Sarabun New" w:cs="TH Sarabun New" w:eastAsia="TH Sarabun New"/>
-                <w:sz w:val="28"/>
-                <w:b w:val="off"/>
-              </w:rPr>
-              <w:t>(  ✓  )  เห็นควรแต่งตั้งคณะอนุกรรมการประเมินผลการสอนและนัดวันประเมินผลการสอนต่อไป</w:t>
+                <w:rFonts w:ascii="TH Sarabun New" w:eastAsia="Times New Roman" w:hAnsi="TH Sarabun New" w:cs="TH Sarabun New"/>
+                <w:sz w:val="28"/>
+                <w:szCs w:val="28"/>
+                <w:lang w:val="en-US" w:eastAsia="en-GB"/>
+              </w:rPr>
+              <w:t/>
+            </w:r>
+            <w:r>
+              <w:rPr>
+                <w:rFonts w:ascii="TH Sarabun New" w:eastAsia="Times New Roman" w:hAnsi="TH Sarabun New" w:cs="TH Sarabun New" w:hint="cs"/>
+                <w:sz w:val="28"/>
+                <w:szCs w:val="28"/>
+                <w:cs/>
+                <w:lang w:val="en-US" w:eastAsia="en-GB"/>
+              </w:rPr>
+              <w:t xml:space="preserve">  )  เห็นควรแต่งตั้งคณะอนุกรรมการประเมินผลการสอนและนัดวันประเมินผลการสอนต่อไป</w:t>
             </w:r>
           </w:p>
           <w:p>
@@ -278,15 +450,54 @@
                 <w:lang w:val="en-US" w:eastAsia="en-GB"/>
               </w:rPr>
             </w:pPr>
+            <w:r>
+              <w:rPr>
+                <w:rFonts w:ascii="TH Sarabun New" w:eastAsia="Times New Roman" w:hAnsi="TH Sarabun New" w:cs="TH Sarabun New" w:hint="cs"/>
+                <w:sz w:val="28"/>
+                <w:szCs w:val="28"/>
+                <w:cs/>
+                <w:lang w:val="en-US" w:eastAsia="en-GB"/>
+              </w:rPr>
+              <w:t>(</w:t>
+            </w:r>
+            <w:r>
+              <w:rPr>
+                <w:rFonts w:ascii="TH Sarabun New" w:eastAsia="Times New Roman" w:hAnsi="TH Sarabun New" w:cs="TH Sarabun New"/>
+                <w:sz w:val="28"/>
+                <w:szCs w:val="28"/>
+                <w:lang w:val="en-US" w:eastAsia="en-GB"/>
+              </w:rPr>
+              <w:t/>
+            </w:r>
             <w:proofErr w:type="spellStart"/>
+            <w:r>
+              <w:rPr>
+                <w:rFonts w:ascii="TH Sarabun New" w:eastAsia="Times New Roman" w:hAnsi="TH Sarabun New" w:cs="TH Sarabun New"/>
+                <w:sz w:val="28"/>
+                <w:szCs w:val="28"/>
+                <w:lang w:val="en-US" w:eastAsia="en-GB"/>
+              </w:rPr>
+              <w:t/>
+            </w:r>
             <w:proofErr w:type="spellEnd"/>
             <w:r>
               <w:rPr>
-                <w:rFonts w:ascii="TH Sarabun New" w:hAnsi="TH Sarabun New" w:cs="TH Sarabun New" w:eastAsia="TH Sarabun New"/>
-                <w:sz w:val="28"/>
-                <w:b w:val="off"/>
-              </w:rPr>
-              <w:t>()</w:t>
+                <w:rFonts w:ascii="TH Sarabun New" w:eastAsia="Times New Roman" w:hAnsi="TH Sarabun New" w:cs="TH Sarabun New"/>
+                <w:sz w:val="28"/>
+                <w:szCs w:val="28"/>
+                <w:lang w:val="en-US" w:eastAsia="en-GB"/>
+              </w:rPr>
+              <w:t/>
+            </w:r>
+            <w:r>
+              <w:rPr>
+                <w:rFonts w:ascii="TH Sarabun New" w:eastAsia="Times New Roman" w:hAnsi="TH Sarabun New" w:cs="TH Sarabun New" w:hint="cs"/>
+                <w:sz w:val="28"/>
+                <w:szCs w:val="28"/>
+                <w:cs/>
+                <w:lang w:val="en-US" w:eastAsia="en-GB"/>
+              </w:rPr>
+              <w:t>)</w:t>
             </w:r>
           </w:p>
           <w:p>
@@ -300,15 +511,34 @@
                 <w:lang w:val="en-US" w:eastAsia="en-GB"/>
               </w:rPr>
             </w:pPr>
+            <w:r>
+              <w:rPr>
+                <w:rFonts w:ascii="TH Sarabun New" w:eastAsia="Times New Roman" w:hAnsi="TH Sarabun New" w:cs="TH Sarabun New"/>
+                <w:sz w:val="28"/>
+                <w:szCs w:val="28"/>
+                <w:lang w:val="en-US" w:eastAsia="en-GB"/>
+              </w:rPr>
+              <w:t>นักทรัพยากรบุคคล</w:t>
+            </w:r>
             <w:proofErr w:type="spellStart"/>
+            <w:r>
+              <w:rPr>
+                <w:rFonts w:ascii="TH Sarabun New" w:eastAsia="Times New Roman" w:hAnsi="TH Sarabun New" w:cs="TH Sarabun New"/>
+                <w:sz w:val="28"/>
+                <w:szCs w:val="28"/>
+                <w:lang w:eastAsia="en-GB"/>
+              </w:rPr>
+              <w:t/>
+            </w:r>
             <w:proofErr w:type="spellEnd"/>
             <w:r>
               <w:rPr>
-                <w:rFonts w:ascii="TH Sarabun New" w:hAnsi="TH Sarabun New" w:cs="TH Sarabun New" w:eastAsia="TH Sarabun New"/>
-                <w:sz w:val="28"/>
-                <w:b w:val="off"/>
-              </w:rPr>
-              <w:t>เจ้าหน้าที่บริหารงานทั่วไป</w:t>
+                <w:rFonts w:ascii="TH Sarabun New" w:eastAsia="Times New Roman" w:hAnsi="TH Sarabun New" w:cs="TH Sarabun New"/>
+                <w:sz w:val="28"/>
+                <w:szCs w:val="28"/>
+                <w:lang w:val="en-US" w:eastAsia="en-GB"/>
+              </w:rPr>
+              <w:t/>
             </w:r>
           </w:p>
         </w:tc>
@@ -600,9 +830,10 @@
     </w:p>
     <w:tbl>
       <w:tblPr>
-        <w:tblStyle w:val="TableGrid"/>
+        <w:tblStyle w:val="ae"/>
         <w:tblW w:w="9945" w:type="dxa"/>
         <w:tblInd w:w="-185" w:type="dxa"/>
+        <w:tblLayout w:type="fixed"/>
         <w:tblLook w:val="04A0" w:firstRow="1" w:lastRow="0" w:firstColumn="1" w:lastColumn="0" w:noHBand="0" w:noVBand="1"/>
       </w:tblPr>
       <w:tblGrid>
@@ -775,15 +1006,54 @@
                 <w:lang w:val="en-US" w:eastAsia="en-GB"/>
               </w:rPr>
             </w:pPr>
+            <w:r>
+              <w:rPr>
+                <w:rFonts w:ascii="TH Sarabun New" w:eastAsia="Times New Roman" w:hAnsi="TH Sarabun New" w:cs="TH Sarabun New" w:hint="cs"/>
+                <w:sz w:val="28"/>
+                <w:szCs w:val="28"/>
+                <w:cs/>
+                <w:lang w:val="en-US" w:eastAsia="en-GB"/>
+              </w:rPr>
+              <w:t xml:space="preserve">( </w:t>
+            </w:r>
+            <w:r>
+              <w:rPr>
+                <w:rFonts w:ascii="TH Sarabun New" w:eastAsia="Times New Roman" w:hAnsi="TH Sarabun New" w:cs="TH Sarabun New"/>
+                <w:sz w:val="28"/>
+                <w:szCs w:val="28"/>
+                <w:lang w:val="en-US" w:eastAsia="en-GB"/>
+              </w:rPr>
+              <w:t/>
+            </w:r>
             <w:proofErr w:type="spellStart"/>
+            <w:r>
+              <w:rPr>
+                <w:rFonts w:ascii="TH Sarabun New" w:eastAsia="Times New Roman" w:hAnsi="TH Sarabun New" w:cs="TH Sarabun New"/>
+                <w:sz w:val="28"/>
+                <w:szCs w:val="28"/>
+                <w:lang w:eastAsia="en-GB"/>
+              </w:rPr>
+              <w:t/>
+            </w:r>
             <w:proofErr w:type="spellEnd"/>
             <w:r>
               <w:rPr>
-                <w:rFonts w:ascii="TH Sarabun New" w:hAnsi="TH Sarabun New" w:cs="TH Sarabun New" w:eastAsia="TH Sarabun New"/>
-                <w:sz w:val="28"/>
-                <w:b w:val="off"/>
-              </w:rPr>
-              <w:t>( ✓  )  เพื่อโปรดพิจารณา</w:t>
+                <w:rFonts w:ascii="TH Sarabun New" w:eastAsia="Times New Roman" w:hAnsi="TH Sarabun New" w:cs="TH Sarabun New"/>
+                <w:sz w:val="28"/>
+                <w:szCs w:val="28"/>
+                <w:lang w:val="en-US" w:eastAsia="en-GB"/>
+              </w:rPr>
+              <w:t/>
+            </w:r>
+            <w:r>
+              <w:rPr>
+                <w:rFonts w:ascii="TH Sarabun New" w:eastAsia="Times New Roman" w:hAnsi="TH Sarabun New" w:cs="TH Sarabun New" w:hint="cs"/>
+                <w:sz w:val="28"/>
+                <w:szCs w:val="28"/>
+                <w:cs/>
+                <w:lang w:val="en-US" w:eastAsia="en-GB"/>
+              </w:rPr>
+              <w:t xml:space="preserve">  )  เพื่อโปรดพิจารณา</w:t>
             </w:r>
           </w:p>
           <w:p>
@@ -795,15 +1065,73 @@
                 <w:lang w:val="en-US" w:eastAsia="en-GB"/>
               </w:rPr>
             </w:pPr>
+            <w:r>
+              <w:rPr>
+                <w:rFonts w:ascii="TH Sarabun New" w:eastAsia="Times New Roman" w:hAnsi="TH Sarabun New" w:cs="TH Sarabun New" w:hint="cs"/>
+                <w:sz w:val="28"/>
+                <w:szCs w:val="28"/>
+                <w:cs/>
+                <w:lang w:val="en-US" w:eastAsia="en-GB"/>
+              </w:rPr>
+              <w:t>(</w:t>
+            </w:r>
+            <w:r>
+              <w:rPr>
+                <w:rFonts w:ascii="TH Sarabun New" w:eastAsia="Times New Roman" w:hAnsi="TH Sarabun New" w:cs="TH Sarabun New" w:hint="cs"/>
+                <w:sz w:val="28"/>
+                <w:szCs w:val="28"/>
+                <w:cs/>
+                <w:lang w:val="en-US" w:eastAsia="en-GB"/>
+              </w:rPr>
+              <w:t xml:space="preserve"> </w:t>
+            </w:r>
+            <w:r>
+              <w:rPr>
+                <w:rFonts w:ascii="TH Sarabun New" w:eastAsia="Times New Roman" w:hAnsi="TH Sarabun New" w:cs="TH Sarabun New"/>
+                <w:sz w:val="28"/>
+                <w:szCs w:val="28"/>
+                <w:lang w:val="en-US" w:eastAsia="en-GB"/>
+              </w:rPr>
+              <w:t/>
+            </w:r>
             <w:proofErr w:type="spellStart"/>
+            <w:r>
+              <w:rPr>
+                <w:rFonts w:ascii="TH Sarabun New" w:eastAsia="Times New Roman" w:hAnsi="TH Sarabun New" w:cs="TH Sarabun New"/>
+                <w:sz w:val="28"/>
+                <w:szCs w:val="28"/>
+                <w:lang w:eastAsia="en-GB"/>
+              </w:rPr>
+              <w:t/>
+            </w:r>
             <w:proofErr w:type="spellEnd"/>
             <w:r>
               <w:rPr>
-                <w:rFonts w:ascii="TH Sarabun New" w:hAnsi="TH Sarabun New" w:cs="TH Sarabun New" w:eastAsia="TH Sarabun New"/>
-                <w:sz w:val="28"/>
-                <w:b w:val="off"/>
-              </w:rPr>
-              <w:t>( ✓  )  เห็นควรแต่งตั้งคณะอนุกรรมการประเมิน จำนวน 3 รายชื่อ ดังนี้</w:t>
+                <w:rFonts w:ascii="TH Sarabun New" w:eastAsia="Times New Roman" w:hAnsi="TH Sarabun New" w:cs="TH Sarabun New"/>
+                <w:sz w:val="28"/>
+                <w:szCs w:val="28"/>
+                <w:lang w:val="en-US" w:eastAsia="en-GB"/>
+              </w:rPr>
+              <w:t/>
+            </w:r>
+            <w:r>
+              <w:rPr>
+                <w:rFonts w:ascii="TH Sarabun New" w:eastAsia="Times New Roman" w:hAnsi="TH Sarabun New" w:cs="TH Sarabun New"/>
+                <w:sz w:val="28"/>
+                <w:szCs w:val="28"/>
+                <w:lang w:val="en-US" w:eastAsia="en-GB"/>
+              </w:rPr>
+              <w:t/>
+            </w:r>
+            <w:r>
+              <w:rPr>
+                <w:rFonts w:ascii="TH Sarabun New" w:eastAsia="Times New Roman" w:hAnsi="TH Sarabun New" w:cs="TH Sarabun New" w:hint="cs"/>
+                <w:sz w:val="28"/>
+                <w:szCs w:val="28"/>
+                <w:cs/>
+                <w:lang w:val="en-US" w:eastAsia="en-GB"/>
+              </w:rPr>
+              <w:t xml:space="preserve">  )  เห็นควรแต่งตั้งคณะอนุกรรมการประเมิน จำนวน 3 รายชื่อ ดังนี้</w:t>
             </w:r>
           </w:p>
           <w:p>
@@ -817,11 +1145,78 @@
             </w:pPr>
             <w:r>
               <w:rPr>
-                <w:rFonts w:ascii="TH Sarabun New" w:hAnsi="TH Sarabun New" w:cs="TH Sarabun New" w:eastAsia="TH Sarabun New"/>
-                <w:sz w:val="28"/>
-                <w:b w:val="off"/>
-              </w:rPr>
-              <w:t>1.dsaปปปปป ประธานอนุกรรมการ (ภายใน)</w:t>
+                <w:rFonts w:ascii="TH Sarabun New" w:eastAsia="Times New Roman" w:hAnsi="TH Sarabun New" w:cs="TH Sarabun New" w:hint="cs"/>
+                <w:sz w:val="28"/>
+                <w:szCs w:val="28"/>
+                <w:cs/>
+                <w:lang w:val="en-US" w:eastAsia="en-GB"/>
+              </w:rPr>
+              <w:t>1.</w:t>
+            </w:r>
+            <w:r>
+              <w:rPr>
+                <w:rFonts w:ascii="TH Sarabun New" w:eastAsia="Times New Roman" w:hAnsi="TH Sarabun New" w:cs="TH Sarabun New"/>
+                <w:sz w:val="28"/>
+                <w:szCs w:val="28"/>
+                <w:lang w:val="en-US" w:eastAsia="en-GB"/>
+              </w:rPr>
+              <w:t/>
+            </w:r>
+            <w:r>
+              <w:rPr>
+                <w:rFonts w:ascii="TH Sarabun New" w:eastAsia="Times New Roman" w:hAnsi="TH Sarabun New" w:cs="TH Sarabun New"/>
+                <w:sz w:val="28"/>
+                <w:szCs w:val="28"/>
+                <w:lang w:val="en-US" w:eastAsia="en-GB"/>
+              </w:rPr>
+              <w:t/>
+            </w:r>
+            <w:r>
+              <w:rPr>
+                <w:rFonts w:ascii="TH Sarabun New" w:eastAsia="Times New Roman" w:hAnsi="TH Sarabun New" w:cs="TH Sarabun New"/>
+                <w:sz w:val="28"/>
+                <w:szCs w:val="28"/>
+                <w:lang w:val="en-US" w:eastAsia="en-GB"/>
+              </w:rPr>
+              <w:t/>
+            </w:r>
+            <w:r>
+              <w:rPr>
+                <w:rFonts w:ascii="TH Sarabun New" w:eastAsia="Times New Roman" w:hAnsi="TH Sarabun New" w:cs="TH Sarabun New"/>
+                <w:sz w:val="28"/>
+                <w:szCs w:val="28"/>
+                <w:lang w:val="en-US" w:eastAsia="en-GB"/>
+              </w:rPr>
+              <w:t/>
+            </w:r>
+            <w:r>
+              <w:rPr>
+                <w:rFonts w:ascii="TH Sarabun New" w:eastAsia="Times New Roman" w:hAnsi="TH Sarabun New" w:cs="TH Sarabun New"/>
+                <w:sz w:val="28"/>
+                <w:szCs w:val="28"/>
+                <w:lang w:val="en-US" w:eastAsia="en-GB"/>
+              </w:rPr>
+              <w:t/>
+            </w:r>
+            <w:r>
+              <w:rPr>
+                <w:rFonts w:ascii="TH Sarabun New" w:eastAsia="Times New Roman" w:hAnsi="TH Sarabun New" w:cs="TH Sarabun New" w:hint="cs"/>
+                <w:sz w:val="28"/>
+                <w:szCs w:val="28"/>
+                <w:cs/>
+                <w:lang w:val="en-US" w:eastAsia="en-GB"/>
+              </w:rPr>
+              <w:t xml:space="preserve"> </w:t>
+            </w:r>
+            <w:r>
+              <w:rPr>
+                <w:rFonts w:ascii="TH Sarabun New" w:eastAsia="Times New Roman" w:hAnsi="TH Sarabun New" w:cs="TH Sarabun New" w:hint="cs"/>
+                <w:sz w:val="28"/>
+                <w:szCs w:val="28"/>
+                <w:cs/>
+                <w:lang w:val="en-US" w:eastAsia="en-GB"/>
+              </w:rPr>
+              <w:t>ประธานอนุกรรมการ (ภายใน)</w:t>
             </w:r>
           </w:p>
           <w:p>
@@ -835,11 +1230,78 @@
             </w:pPr>
             <w:r>
               <w:rPr>
-                <w:rFonts w:ascii="TH Sarabun New" w:hAnsi="TH Sarabun New" w:cs="TH Sarabun New" w:eastAsia="TH Sarabun New"/>
-                <w:sz w:val="28"/>
-                <w:b w:val="off"/>
-              </w:rPr>
-              <w:t>2.dsaหหหหหห อนุกรรมการ (ภานนอก)</w:t>
+                <w:rFonts w:ascii="TH Sarabun New" w:eastAsia="Times New Roman" w:hAnsi="TH Sarabun New" w:cs="TH Sarabun New" w:hint="cs"/>
+                <w:sz w:val="28"/>
+                <w:szCs w:val="28"/>
+                <w:cs/>
+                <w:lang w:val="en-US" w:eastAsia="en-GB"/>
+              </w:rPr>
+              <w:t>2.</w:t>
+            </w:r>
+            <w:r>
+              <w:rPr>
+                <w:rFonts w:ascii="TH Sarabun New" w:eastAsia="Times New Roman" w:hAnsi="TH Sarabun New" w:cs="TH Sarabun New"/>
+                <w:sz w:val="28"/>
+                <w:szCs w:val="28"/>
+                <w:lang w:val="en-US" w:eastAsia="en-GB"/>
+              </w:rPr>
+              <w:t/>
+            </w:r>
+            <w:r>
+              <w:rPr>
+                <w:rFonts w:ascii="TH Sarabun New" w:eastAsia="Times New Roman" w:hAnsi="TH Sarabun New" w:cs="TH Sarabun New"/>
+                <w:sz w:val="28"/>
+                <w:szCs w:val="28"/>
+                <w:lang w:val="en-US" w:eastAsia="en-GB"/>
+              </w:rPr>
+              <w:t/>
+            </w:r>
+            <w:r>
+              <w:rPr>
+                <w:rFonts w:ascii="TH Sarabun New" w:eastAsia="Times New Roman" w:hAnsi="TH Sarabun New" w:cs="TH Sarabun New"/>
+                <w:sz w:val="28"/>
+                <w:szCs w:val="28"/>
+                <w:lang w:val="en-US" w:eastAsia="en-GB"/>
+              </w:rPr>
+              <w:t/>
+            </w:r>
+            <w:r>
+              <w:rPr>
+                <w:rFonts w:ascii="TH Sarabun New" w:eastAsia="Times New Roman" w:hAnsi="TH Sarabun New" w:cs="TH Sarabun New"/>
+                <w:sz w:val="28"/>
+                <w:szCs w:val="28"/>
+                <w:lang w:val="en-US" w:eastAsia="en-GB"/>
+              </w:rPr>
+              <w:t/>
+            </w:r>
+            <w:r>
+              <w:rPr>
+                <w:rFonts w:ascii="TH Sarabun New" w:eastAsia="Times New Roman" w:hAnsi="TH Sarabun New" w:cs="TH Sarabun New"/>
+                <w:sz w:val="28"/>
+                <w:szCs w:val="28"/>
+                <w:lang w:val="en-US" w:eastAsia="en-GB"/>
+              </w:rPr>
+              <w:t/>
+            </w:r>
+            <w:r>
+              <w:rPr>
+                <w:rFonts w:ascii="TH Sarabun New" w:eastAsia="Times New Roman" w:hAnsi="TH Sarabun New" w:cs="TH Sarabun New" w:hint="cs"/>
+                <w:sz w:val="28"/>
+                <w:szCs w:val="28"/>
+                <w:cs/>
+                <w:lang w:val="en-US" w:eastAsia="en-GB"/>
+              </w:rPr>
+              <w:t xml:space="preserve"> </w:t>
+            </w:r>
+            <w:r>
+              <w:rPr>
+                <w:rFonts w:ascii="TH Sarabun New" w:eastAsia="Times New Roman" w:hAnsi="TH Sarabun New" w:cs="TH Sarabun New" w:hint="cs"/>
+                <w:sz w:val="28"/>
+                <w:szCs w:val="28"/>
+                <w:cs/>
+                <w:lang w:val="en-US" w:eastAsia="en-GB"/>
+              </w:rPr>
+              <w:t>อนุกรรมการ (ภานนอก)</w:t>
             </w:r>
           </w:p>
           <w:p>
@@ -853,11 +1315,78 @@
             </w:pPr>
             <w:r>
               <w:rPr>
-                <w:rFonts w:ascii="TH Sarabun New" w:hAnsi="TH Sarabun New" w:cs="TH Sarabun New" w:eastAsia="TH Sarabun New"/>
-                <w:sz w:val="28"/>
-                <w:b w:val="off"/>
-              </w:rPr>
-              <w:t>3.dsaไไไไไไไไไ อนุกรรมการและเลาขานุการ (ภายใน)</w:t>
+                <w:rFonts w:ascii="TH Sarabun New" w:eastAsia="Times New Roman" w:hAnsi="TH Sarabun New" w:cs="TH Sarabun New" w:hint="cs"/>
+                <w:sz w:val="28"/>
+                <w:szCs w:val="28"/>
+                <w:cs/>
+                <w:lang w:val="en-US" w:eastAsia="en-GB"/>
+              </w:rPr>
+              <w:t>3.</w:t>
+            </w:r>
+            <w:r>
+              <w:rPr>
+                <w:rFonts w:ascii="TH Sarabun New" w:eastAsia="Times New Roman" w:hAnsi="TH Sarabun New" w:cs="TH Sarabun New"/>
+                <w:sz w:val="28"/>
+                <w:szCs w:val="28"/>
+                <w:lang w:val="en-US" w:eastAsia="en-GB"/>
+              </w:rPr>
+              <w:t/>
+            </w:r>
+            <w:r>
+              <w:rPr>
+                <w:rFonts w:ascii="TH Sarabun New" w:eastAsia="Times New Roman" w:hAnsi="TH Sarabun New" w:cs="TH Sarabun New"/>
+                <w:sz w:val="28"/>
+                <w:szCs w:val="28"/>
+                <w:lang w:val="en-US" w:eastAsia="en-GB"/>
+              </w:rPr>
+              <w:t/>
+            </w:r>
+            <w:r>
+              <w:rPr>
+                <w:rFonts w:ascii="TH Sarabun New" w:eastAsia="Times New Roman" w:hAnsi="TH Sarabun New" w:cs="TH Sarabun New"/>
+                <w:sz w:val="28"/>
+                <w:szCs w:val="28"/>
+                <w:lang w:val="en-US" w:eastAsia="en-GB"/>
+              </w:rPr>
+              <w:t/>
+            </w:r>
+            <w:r>
+              <w:rPr>
+                <w:rFonts w:ascii="TH Sarabun New" w:eastAsia="Times New Roman" w:hAnsi="TH Sarabun New" w:cs="TH Sarabun New"/>
+                <w:sz w:val="28"/>
+                <w:szCs w:val="28"/>
+                <w:lang w:val="en-US" w:eastAsia="en-GB"/>
+              </w:rPr>
+              <w:t/>
+            </w:r>
+            <w:r>
+              <w:rPr>
+                <w:rFonts w:ascii="TH Sarabun New" w:eastAsia="Times New Roman" w:hAnsi="TH Sarabun New" w:cs="TH Sarabun New"/>
+                <w:sz w:val="28"/>
+                <w:szCs w:val="28"/>
+                <w:lang w:val="en-US" w:eastAsia="en-GB"/>
+              </w:rPr>
+              <w:t/>
+            </w:r>
+            <w:r>
+              <w:rPr>
+                <w:rFonts w:ascii="TH Sarabun New" w:eastAsia="Times New Roman" w:hAnsi="TH Sarabun New" w:cs="TH Sarabun New" w:hint="cs"/>
+                <w:sz w:val="28"/>
+                <w:szCs w:val="28"/>
+                <w:cs/>
+                <w:lang w:val="en-US" w:eastAsia="en-GB"/>
+              </w:rPr>
+              <w:t xml:space="preserve"> </w:t>
+            </w:r>
+            <w:r>
+              <w:rPr>
+                <w:rFonts w:ascii="TH Sarabun New" w:eastAsia="Times New Roman" w:hAnsi="TH Sarabun New" w:cs="TH Sarabun New" w:hint="cs"/>
+                <w:sz w:val="28"/>
+                <w:szCs w:val="28"/>
+                <w:cs/>
+                <w:lang w:val="en-US" w:eastAsia="en-GB"/>
+              </w:rPr>
+              <w:t>อนุกรรมการและเลาขานุการ (ภายใน)</w:t>
             </w:r>
           </w:p>
           <w:p>
@@ -880,15 +1409,54 @@
                 <w:lang w:val="en-US" w:eastAsia="en-GB"/>
               </w:rPr>
             </w:pPr>
+            <w:r>
+              <w:rPr>
+                <w:rFonts w:ascii="TH Sarabun New" w:eastAsia="Times New Roman" w:hAnsi="TH Sarabun New" w:cs="TH Sarabun New" w:hint="cs"/>
+                <w:sz w:val="28"/>
+                <w:szCs w:val="28"/>
+                <w:cs/>
+                <w:lang w:val="en-US" w:eastAsia="en-GB"/>
+              </w:rPr>
+              <w:t>(</w:t>
+            </w:r>
+            <w:r>
+              <w:rPr>
+                <w:rFonts w:ascii="TH Sarabun New" w:eastAsia="Times New Roman" w:hAnsi="TH Sarabun New" w:cs="TH Sarabun New"/>
+                <w:sz w:val="28"/>
+                <w:szCs w:val="28"/>
+                <w:lang w:val="en-US" w:eastAsia="en-GB"/>
+              </w:rPr>
+              <w:t/>
+            </w:r>
             <w:proofErr w:type="spellStart"/>
+            <w:r>
+              <w:rPr>
+                <w:rFonts w:ascii="TH Sarabun New" w:eastAsia="Times New Roman" w:hAnsi="TH Sarabun New" w:cs="TH Sarabun New"/>
+                <w:sz w:val="28"/>
+                <w:szCs w:val="28"/>
+                <w:lang w:val="en-US" w:eastAsia="en-GB"/>
+              </w:rPr>
+              <w:t/>
+            </w:r>
             <w:proofErr w:type="spellEnd"/>
             <w:r>
               <w:rPr>
-                <w:rFonts w:ascii="TH Sarabun New" w:hAnsi="TH Sarabun New" w:cs="TH Sarabun New" w:eastAsia="TH Sarabun New"/>
-                <w:sz w:val="28"/>
-                <w:b w:val="off"/>
-              </w:rPr>
-              <w:t>()</w:t>
+                <w:rFonts w:ascii="TH Sarabun New" w:eastAsia="Times New Roman" w:hAnsi="TH Sarabun New" w:cs="TH Sarabun New"/>
+                <w:sz w:val="28"/>
+                <w:szCs w:val="28"/>
+                <w:lang w:val="en-US" w:eastAsia="en-GB"/>
+              </w:rPr>
+              <w:t/>
+            </w:r>
+            <w:r>
+              <w:rPr>
+                <w:rFonts w:ascii="TH Sarabun New" w:eastAsia="Times New Roman" w:hAnsi="TH Sarabun New" w:cs="TH Sarabun New" w:hint="cs"/>
+                <w:sz w:val="28"/>
+                <w:szCs w:val="28"/>
+                <w:cs/>
+                <w:lang w:val="en-US" w:eastAsia="en-GB"/>
+              </w:rPr>
+              <w:t>)</w:t>
             </w:r>
           </w:p>
           <w:p>
@@ -901,15 +1469,34 @@
                 <w:lang w:val="en-US" w:eastAsia="en-GB"/>
               </w:rPr>
             </w:pPr>
+            <w:r>
+              <w:rPr>
+                <w:rFonts w:ascii="TH Sarabun New" w:eastAsia="Times New Roman" w:hAnsi="TH Sarabun New" w:cs="TH Sarabun New"/>
+                <w:sz w:val="28"/>
+                <w:szCs w:val="28"/>
+                <w:lang w:val="en-US" w:eastAsia="en-GB"/>
+              </w:rPr>
+              <w:t>หัวหน้าสาขาวิทยาการคอมพิวเตอร์</w:t>
+            </w:r>
             <w:proofErr w:type="spellStart"/>
+            <w:r>
+              <w:rPr>
+                <w:rFonts w:ascii="TH Sarabun New" w:eastAsia="Times New Roman" w:hAnsi="TH Sarabun New" w:cs="TH Sarabun New"/>
+                <w:sz w:val="28"/>
+                <w:szCs w:val="28"/>
+                <w:lang w:val="en-US" w:eastAsia="en-GB"/>
+              </w:rPr>
+              <w:t/>
+            </w:r>
             <w:proofErr w:type="spellEnd"/>
             <w:r>
               <w:rPr>
-                <w:rFonts w:ascii="TH Sarabun New" w:hAnsi="TH Sarabun New" w:cs="TH Sarabun New" w:eastAsia="TH Sarabun New"/>
-                <w:sz w:val="28"/>
-                <w:b w:val="off"/>
-              </w:rPr>
-              <w:t>หัวหน้าสาขาวิทยาการคอมพิวเตอร์</w:t>
+                <w:rFonts w:ascii="TH Sarabun New" w:eastAsia="Times New Roman" w:hAnsi="TH Sarabun New" w:cs="TH Sarabun New"/>
+                <w:sz w:val="28"/>
+                <w:szCs w:val="28"/>
+                <w:lang w:val="en-US" w:eastAsia="en-GB"/>
+              </w:rPr>
+              <w:t/>
             </w:r>
           </w:p>
         </w:tc>
@@ -928,11 +1515,69 @@
             </w:pPr>
             <w:r>
               <w:rPr>
-                <w:rFonts w:ascii="TH Sarabun New" w:hAnsi="TH Sarabun New" w:cs="TH Sarabun New" w:eastAsia="TH Sarabun New"/>
-                <w:sz w:val="28"/>
-                <w:b w:val="off"/>
-              </w:rPr>
-              <w:t>( ✓  )  เห็นชอบ และดำเนินการนัดวันประเมินผลการสอนต่อไป</w:t>
+                <w:rFonts w:ascii="TH Sarabun New" w:eastAsia="Times New Roman" w:hAnsi="TH Sarabun New" w:cs="TH Sarabun New" w:hint="cs"/>
+                <w:sz w:val="28"/>
+                <w:szCs w:val="28"/>
+                <w:cs/>
+                <w:lang w:val="en-US" w:eastAsia="en-GB"/>
+              </w:rPr>
+              <w:t>(</w:t>
+            </w:r>
+            <w:r>
+              <w:rPr>
+                <w:rFonts w:ascii="TH Sarabun New" w:eastAsia="Times New Roman" w:hAnsi="TH Sarabun New" w:cs="TH Sarabun New" w:hint="cs"/>
+                <w:sz w:val="28"/>
+                <w:szCs w:val="28"/>
+                <w:cs/>
+                <w:lang w:val="en-US" w:eastAsia="en-GB"/>
+              </w:rPr>
+              <w:t xml:space="preserve"> </w:t>
+            </w:r>
+            <w:r>
+              <w:rPr>
+                <w:rFonts w:ascii="TH Sarabun New" w:eastAsia="Times New Roman" w:hAnsi="TH Sarabun New" w:cs="TH Sarabun New"/>
+                <w:sz w:val="28"/>
+                <w:szCs w:val="28"/>
+                <w:lang w:val="en-US" w:eastAsia="en-GB"/>
+              </w:rPr>
+              <w:t/>
+            </w:r>
+            <w:r>
+              <w:rPr>
+                <w:rFonts w:ascii="TH Sarabun New" w:eastAsia="Times New Roman" w:hAnsi="TH Sarabun New" w:cs="TH Sarabun New"/>
+                <w:sz w:val="28"/>
+                <w:szCs w:val="28"/>
+                <w:lang w:eastAsia="en-GB"/>
+              </w:rPr>
+              <w:t/>
+            </w:r>
+            <w:r>
+              <w:rPr>
+                <w:rFonts w:ascii="TH Sarabun New" w:eastAsia="Times New Roman" w:hAnsi="TH Sarabun New" w:cs="TH Sarabun New"/>
+                <w:sz w:val="28"/>
+                <w:szCs w:val="28"/>
+                <w:lang w:eastAsia="en-GB"/>
+              </w:rPr>
+              <w:t/>
+            </w:r>
+            <w:r>
+              <w:rPr>
+                <w:rFonts w:ascii="TH Sarabun New" w:eastAsia="Times New Roman" w:hAnsi="TH Sarabun New" w:cs="TH Sarabun New"/>
+                <w:sz w:val="28"/>
+                <w:szCs w:val="28"/>
+                <w:lang w:val="en-US" w:eastAsia="en-GB"/>
+              </w:rPr>
+              <w:t/>
+            </w:r>
+            <w:r>
+              <w:rPr>
+                <w:rFonts w:ascii="TH Sarabun New" w:eastAsia="Times New Roman" w:hAnsi="TH Sarabun New" w:cs="TH Sarabun New" w:hint="cs"/>
+                <w:sz w:val="28"/>
+                <w:szCs w:val="28"/>
+                <w:cs/>
+                <w:lang w:val="en-US" w:eastAsia="en-GB"/>
+              </w:rPr>
+              <w:t xml:space="preserve">  )  เห็นชอบ และดำเนินการนัดวันประเมินผลการสอนต่อไป</w:t>
             </w:r>
           </w:p>
           <w:p>
@@ -944,14 +1589,145 @@
                 <w:lang w:val="en-US" w:eastAsia="en-GB"/>
               </w:rPr>
             </w:pPr>
-            <w:r>
-              <w:rPr>
-                <w:rFonts w:ascii="TH Sarabun New" w:hAnsi="TH Sarabun New" w:cs="TH Sarabun New" w:eastAsia="TH Sarabun New"/>
-                <w:sz w:val="28"/>
-                <w:b w:val="off"/>
-              </w:rPr>
-              <w:t>(✓) .....................................................................</w:t>
-            </w:r>
+            <w:proofErr w:type="gramStart"/>
+            <w:r>
+              <w:rPr>
+                <w:rFonts w:ascii="TH Sarabun New" w:eastAsia="Times New Roman" w:hAnsi="TH Sarabun New" w:cs="TH Sarabun New"/>
+                <w:sz w:val="28"/>
+                <w:szCs w:val="28"/>
+                <w:lang w:val="en-US" w:eastAsia="en-GB"/>
+              </w:rPr>
+              <w:t>(</w:t>
+            </w:r>
+            <w:r>
+              <w:rPr>
+                <w:rFonts w:ascii="TH Sarabun New" w:eastAsia="Times New Roman" w:hAnsi="TH Sarabun New" w:cs="TH Sarabun New"/>
+                <w:sz w:val="28"/>
+                <w:szCs w:val="28"/>
+                <w:lang w:val="en-US" w:eastAsia="en-GB"/>
+              </w:rPr>
+              <w:t xml:space="preserve"> </w:t>
+            </w:r>
+            <w:r>
+              <w:rPr>
+                <w:rFonts w:ascii="TH Sarabun New" w:eastAsia="Times New Roman" w:hAnsi="TH Sarabun New" w:cs="TH Sarabun New"/>
+                <w:sz w:val="28"/>
+                <w:szCs w:val="28"/>
+                <w:lang w:val="en-US" w:eastAsia="en-GB"/>
+              </w:rPr>
+              <w:t/>
+            </w:r>
+            <w:proofErr w:type="gramEnd"/>
+            <w:r>
+              <w:rPr>
+                <w:rFonts w:ascii="TH Sarabun New" w:eastAsia="Times New Roman" w:hAnsi="TH Sarabun New" w:cs="TH Sarabun New"/>
+                <w:sz w:val="28"/>
+                <w:szCs w:val="28"/>
+                <w:lang w:val="en-US" w:eastAsia="en-GB"/>
+              </w:rPr>
+              <w:t/>
+            </w:r>
+            <w:r>
+              <w:rPr>
+                <w:rFonts w:ascii="TH Sarabun New" w:eastAsia="Times New Roman" w:hAnsi="TH Sarabun New" w:cs="TH Sarabun New"/>
+                <w:sz w:val="28"/>
+                <w:szCs w:val="28"/>
+                <w:lang w:eastAsia="en-GB"/>
+              </w:rPr>
+              <w:t/>
+            </w:r>
+            <w:r>
+              <w:rPr>
+                <w:rFonts w:ascii="TH Sarabun New" w:eastAsia="Times New Roman" w:hAnsi="TH Sarabun New" w:cs="TH Sarabun New"/>
+                <w:sz w:val="28"/>
+                <w:szCs w:val="28"/>
+                <w:lang w:eastAsia="en-GB"/>
+              </w:rPr>
+              <w:t/>
+            </w:r>
+            <w:r>
+              <w:rPr>
+                <w:rFonts w:ascii="TH Sarabun New" w:eastAsia="Times New Roman" w:hAnsi="TH Sarabun New" w:cs="TH Sarabun New"/>
+                <w:sz w:val="28"/>
+                <w:szCs w:val="28"/>
+                <w:lang w:val="en-US" w:eastAsia="en-GB"/>
+              </w:rPr>
+              <w:t/>
+            </w:r>
+            <w:proofErr w:type="gramStart"/>
+            <w:r>
+              <w:rPr>
+                <w:rFonts w:ascii="TH Sarabun New" w:eastAsia="Times New Roman" w:hAnsi="TH Sarabun New" w:cs="TH Sarabun New"/>
+                <w:sz w:val="28"/>
+                <w:szCs w:val="28"/>
+                <w:lang w:val="en-US" w:eastAsia="en-GB"/>
+              </w:rPr>
+              <w:t/>
+            </w:r>
+            <w:r>
+              <w:rPr>
+                <w:rFonts w:ascii="TH Sarabun New" w:hAnsi="TH Sarabun New" w:cs="TH Sarabun New"/>
+                <w:lang w:val="en-US" w:eastAsia="en-GB"/>
+              </w:rPr>
+              <w:t xml:space="preserve"> </w:t>
+            </w:r>
+            <w:r>
+              <w:rPr>
+                <w:rFonts w:ascii="TH Sarabun New" w:hAnsi="TH Sarabun New" w:cs="TH Sarabun New"/>
+                <w:lang w:val="en-US" w:eastAsia="en-GB"/>
+              </w:rPr>
+              <w:t>)</w:t>
+            </w:r>
+            <w:proofErr w:type="gramEnd"/>
+            <w:r>
+              <w:rPr>
+                <w:rFonts w:ascii="TH Sarabun New" w:eastAsia="Times New Roman" w:hAnsi="TH Sarabun New" w:cs="TH Sarabun New"/>
+                <w:sz w:val="28"/>
+                <w:szCs w:val="28"/>
+                <w:cs/>
+                <w:lang w:val="en-US" w:eastAsia="en-GB"/>
+              </w:rPr>
+              <w:t xml:space="preserve"> </w:t>
+            </w:r>
+            <w:r>
+              <w:rPr>
+                <w:rFonts w:ascii="TH Sarabun New" w:eastAsia="Times New Roman" w:hAnsi="TH Sarabun New" w:cs="TH Sarabun New"/>
+                <w:sz w:val="28"/>
+                <w:szCs w:val="28"/>
+                <w:lang w:val="en-US" w:eastAsia="en-GB"/>
+              </w:rPr>
+              <w:t/>
+            </w:r>
+            <w:proofErr w:type="spellStart"/>
+            <w:r>
+              <w:rPr>
+                <w:rFonts w:ascii="TH Sarabun New" w:eastAsia="Times New Roman" w:hAnsi="TH Sarabun New" w:cs="TH Sarabun New"/>
+                <w:sz w:val="28"/>
+                <w:szCs w:val="28"/>
+                <w:lang w:val="en-US" w:eastAsia="en-GB"/>
+              </w:rPr>
+              <w:t/>
+            </w:r>
+            <w:proofErr w:type="spellEnd"/>
+            <w:r>
+              <w:rPr>
+                <w:rFonts w:ascii="TH Sarabun New" w:eastAsia="Times New Roman" w:hAnsi="TH Sarabun New" w:cs="TH Sarabun New"/>
+                <w:sz w:val="28"/>
+                <w:szCs w:val="28"/>
+                <w:lang w:val="en-US" w:eastAsia="en-GB"/>
+              </w:rPr>
+              <w:t/>
+            </w:r>
+          </w:p>
+          <w:p>
+            <w:pPr>
+              <w:rPr>
+                <w:rFonts w:ascii="TH Sarabun New" w:eastAsia="Times New Roman" w:hAnsi="TH Sarabun New" w:cs="TH Sarabun New"/>
+                <w:sz w:val="28"/>
+                <w:szCs w:val="28"/>
+                <w:lang w:val="en-US" w:eastAsia="en-GB"/>
+              </w:rPr>
+            </w:pPr>
           </w:p>
           <w:p>
             <w:pPr>
@@ -994,15 +1770,54 @@
                 <w:lang w:val="en-US" w:eastAsia="en-GB"/>
               </w:rPr>
             </w:pPr>
+            <w:r>
+              <w:rPr>
+                <w:rFonts w:ascii="TH Sarabun New" w:eastAsia="Times New Roman" w:hAnsi="TH Sarabun New" w:cs="TH Sarabun New" w:hint="cs"/>
+                <w:sz w:val="28"/>
+                <w:szCs w:val="28"/>
+                <w:cs/>
+                <w:lang w:val="en-US" w:eastAsia="en-GB"/>
+              </w:rPr>
+              <w:t>(</w:t>
+            </w:r>
+            <w:r>
+              <w:rPr>
+                <w:rFonts w:ascii="TH Sarabun New" w:eastAsia="Times New Roman" w:hAnsi="TH Sarabun New" w:cs="TH Sarabun New"/>
+                <w:sz w:val="28"/>
+                <w:szCs w:val="28"/>
+                <w:lang w:val="en-US" w:eastAsia="en-GB"/>
+              </w:rPr>
+              <w:t/>
+            </w:r>
             <w:proofErr w:type="spellStart"/>
+            <w:r>
+              <w:rPr>
+                <w:rFonts w:ascii="TH Sarabun New" w:eastAsia="Times New Roman" w:hAnsi="TH Sarabun New" w:cs="TH Sarabun New"/>
+                <w:sz w:val="28"/>
+                <w:szCs w:val="28"/>
+                <w:lang w:eastAsia="en-GB"/>
+              </w:rPr>
+              <w:t/>
+            </w:r>
             <w:proofErr w:type="spellEnd"/>
             <w:r>
               <w:rPr>
-                <w:rFonts w:ascii="TH Sarabun New" w:hAnsi="TH Sarabun New" w:cs="TH Sarabun New" w:eastAsia="TH Sarabun New"/>
-                <w:sz w:val="28"/>
-                <w:b w:val="off"/>
-              </w:rPr>
-              <w:t>(ssssssssssssssssssssss)</w:t>
+                <w:rFonts w:ascii="TH Sarabun New" w:eastAsia="Times New Roman" w:hAnsi="TH Sarabun New" w:cs="TH Sarabun New"/>
+                <w:sz w:val="28"/>
+                <w:szCs w:val="28"/>
+                <w:lang w:val="en-US" w:eastAsia="en-GB"/>
+              </w:rPr>
+              <w:t/>
+            </w:r>
+            <w:r>
+              <w:rPr>
+                <w:rFonts w:ascii="TH Sarabun New" w:eastAsia="Times New Roman" w:hAnsi="TH Sarabun New" w:cs="TH Sarabun New" w:hint="cs"/>
+                <w:sz w:val="28"/>
+                <w:szCs w:val="28"/>
+                <w:cs/>
+                <w:lang w:val="en-US" w:eastAsia="en-GB"/>
+              </w:rPr>
+              <w:t>)</w:t>
             </w:r>
           </w:p>
           <w:p>
@@ -1016,15 +1831,44 @@
                 <w:lang w:val="en-US" w:eastAsia="en-GB"/>
               </w:rPr>
             </w:pPr>
+            <w:r>
+              <w:rPr>
+                <w:rFonts w:ascii="TH Sarabun New" w:eastAsia="Times New Roman" w:hAnsi="TH Sarabun New" w:cs="TH Sarabun New"/>
+                <w:sz w:val="28"/>
+                <w:szCs w:val="28"/>
+                <w:lang w:val="en-US" w:eastAsia="en-GB"/>
+              </w:rPr>
+              <w:t/>
+            </w:r>
             <w:proofErr w:type="spellStart"/>
+            <w:r>
+              <w:rPr>
+                <w:rFonts w:ascii="TH Sarabun New" w:eastAsia="Times New Roman" w:hAnsi="TH Sarabun New" w:cs="TH Sarabun New"/>
+                <w:sz w:val="28"/>
+                <w:szCs w:val="28"/>
+                <w:lang w:val="en-US" w:eastAsia="en-GB"/>
+              </w:rPr>
+              <w:t/>
+            </w:r>
             <w:proofErr w:type="spellEnd"/>
             <w:r>
               <w:rPr>
-                <w:rFonts w:ascii="TH Sarabun New" w:hAnsi="TH Sarabun New" w:cs="TH Sarabun New" w:eastAsia="TH Sarabun New"/>
-                <w:sz w:val="28"/>
-                <w:b w:val="off"/>
-              </w:rPr>
-              <w:t xml:space="preserve">คณบดีวิทยาลัยการคอมพิวเตอร์ </w:t>
+                <w:rFonts w:ascii="TH Sarabun New" w:eastAsia="Times New Roman" w:hAnsi="TH Sarabun New" w:cs="TH Sarabun New"/>
+                <w:sz w:val="28"/>
+                <w:szCs w:val="28"/>
+                <w:lang w:val="en-US" w:eastAsia="en-GB"/>
+              </w:rPr>
+              <w:t/>
+            </w:r>
+            <w:r>
+              <w:rPr>
+                <w:rFonts w:ascii="TH Sarabun New" w:eastAsia="Times New Roman" w:hAnsi="TH Sarabun New" w:cs="TH Sarabun New" w:hint="cs"/>
+                <w:sz w:val="28"/>
+                <w:szCs w:val="28"/>
+                <w:cs/>
+                <w:lang w:val="en-US" w:eastAsia="en-GB"/>
+              </w:rPr>
+              <w:t xml:space="preserve"> </w:t>
             </w:r>
           </w:p>
         </w:tc>
@@ -1489,7 +2333,7 @@
     <w:lsdException w:name="Unresolved Mention" w:semiHidden="1" w:unhideWhenUsed="1"/>
     <w:lsdException w:name="Smart Link" w:semiHidden="1" w:unhideWhenUsed="1"/>
   </w:latentStyles>
-  <w:style w:type="paragraph" w:default="1" w:styleId="Normal">
+  <w:style w:type="paragraph" w:default="1" w:styleId="a">
     <w:name w:val="Normal"/>
     <w:qFormat/>
     <w:rsid w:val="00824612"/>
@@ -1505,11 +2349,11 @@
       <w14:ligatures w14:val="none"/>
     </w:rPr>
   </w:style>
-  <w:style w:type="paragraph" w:styleId="Heading1">
+  <w:style w:type="paragraph" w:styleId="1">
     <w:name w:val="heading 1"/>
-    <w:basedOn w:val="Normal"/>
-    <w:next w:val="Normal"/>
-    <w:link w:val="Heading1Char"/>
+    <w:basedOn w:val="a"/>
+    <w:next w:val="a"/>
+    <w:link w:val="10"/>
     <w:uiPriority w:val="9"/>
     <w:qFormat/>
     <w:rsid w:val="00824612"/>
@@ -1529,11 +2373,11 @@
       <w14:ligatures w14:val="standardContextual"/>
     </w:rPr>
   </w:style>
-  <w:style w:type="paragraph" w:styleId="Heading2">
+  <w:style w:type="paragraph" w:styleId="2">
     <w:name w:val="heading 2"/>
-    <w:basedOn w:val="Normal"/>
-    <w:next w:val="Normal"/>
-    <w:link w:val="Heading2Char"/>
+    <w:basedOn w:val="a"/>
+    <w:next w:val="a"/>
+    <w:link w:val="20"/>
     <w:uiPriority w:val="9"/>
     <w:semiHidden/>
     <w:unhideWhenUsed/>
@@ -1555,11 +2399,11 @@
       <w14:ligatures w14:val="standardContextual"/>
     </w:rPr>
   </w:style>
-  <w:style w:type="paragraph" w:styleId="Heading3">
+  <w:style w:type="paragraph" w:styleId="3">
     <w:name w:val="heading 3"/>
-    <w:basedOn w:val="Normal"/>
-    <w:next w:val="Normal"/>
-    <w:link w:val="Heading3Char"/>
+    <w:basedOn w:val="a"/>
+    <w:next w:val="a"/>
+    <w:link w:val="30"/>
     <w:uiPriority w:val="9"/>
     <w:semiHidden/>
     <w:unhideWhenUsed/>
@@ -1581,11 +2425,11 @@
       <w14:ligatures w14:val="standardContextual"/>
     </w:rPr>
   </w:style>
-  <w:style w:type="paragraph" w:styleId="Heading4">
+  <w:style w:type="paragraph" w:styleId="4">
     <w:name w:val="heading 4"/>
-    <w:basedOn w:val="Normal"/>
-    <w:next w:val="Normal"/>
-    <w:link w:val="Heading4Char"/>
+    <w:basedOn w:val="a"/>
+    <w:next w:val="a"/>
+    <w:link w:val="40"/>
     <w:uiPriority w:val="9"/>
     <w:semiHidden/>
     <w:unhideWhenUsed/>
@@ -1609,11 +2453,11 @@
       <w14:ligatures w14:val="standardContextual"/>
     </w:rPr>
   </w:style>
-  <w:style w:type="paragraph" w:styleId="Heading5">
+  <w:style w:type="paragraph" w:styleId="5">
     <w:name w:val="heading 5"/>
-    <w:basedOn w:val="Normal"/>
-    <w:next w:val="Normal"/>
-    <w:link w:val="Heading5Char"/>
+    <w:basedOn w:val="a"/>
+    <w:next w:val="a"/>
+    <w:link w:val="50"/>
     <w:uiPriority w:val="9"/>
     <w:semiHidden/>
     <w:unhideWhenUsed/>
@@ -1635,11 +2479,11 @@
       <w14:ligatures w14:val="standardContextual"/>
     </w:rPr>
   </w:style>
-  <w:style w:type="paragraph" w:styleId="Heading6">
+  <w:style w:type="paragraph" w:styleId="6">
     <w:name w:val="heading 6"/>
-    <w:basedOn w:val="Normal"/>
-    <w:next w:val="Normal"/>
-    <w:link w:val="Heading6Char"/>
+    <w:basedOn w:val="a"/>
+    <w:next w:val="a"/>
+    <w:link w:val="60"/>
     <w:uiPriority w:val="9"/>
     <w:semiHidden/>
     <w:unhideWhenUsed/>
@@ -1663,11 +2507,11 @@
       <w14:ligatures w14:val="standardContextual"/>
     </w:rPr>
   </w:style>
-  <w:style w:type="paragraph" w:styleId="Heading7">
+  <w:style w:type="paragraph" w:styleId="7">
     <w:name w:val="heading 7"/>
-    <w:basedOn w:val="Normal"/>
-    <w:next w:val="Normal"/>
-    <w:link w:val="Heading7Char"/>
+    <w:basedOn w:val="a"/>
+    <w:next w:val="a"/>
+    <w:link w:val="70"/>
     <w:uiPriority w:val="9"/>
     <w:semiHidden/>
     <w:unhideWhenUsed/>
@@ -1689,11 +2533,11 @@
       <w14:ligatures w14:val="standardContextual"/>
     </w:rPr>
   </w:style>
-  <w:style w:type="paragraph" w:styleId="Heading8">
+  <w:style w:type="paragraph" w:styleId="8">
     <w:name w:val="heading 8"/>
-    <w:basedOn w:val="Normal"/>
-    <w:next w:val="Normal"/>
-    <w:link w:val="Heading8Char"/>
+    <w:basedOn w:val="a"/>
+    <w:next w:val="a"/>
+    <w:link w:val="80"/>
     <w:uiPriority w:val="9"/>
     <w:semiHidden/>
     <w:unhideWhenUsed/>
@@ -1717,11 +2561,11 @@
       <w14:ligatures w14:val="standardContextual"/>
     </w:rPr>
   </w:style>
-  <w:style w:type="paragraph" w:styleId="Heading9">
+  <w:style w:type="paragraph" w:styleId="9">
     <w:name w:val="heading 9"/>
-    <w:basedOn w:val="Normal"/>
-    <w:next w:val="Normal"/>
-    <w:link w:val="Heading9Char"/>
+    <w:basedOn w:val="a"/>
+    <w:next w:val="a"/>
+    <w:link w:val="90"/>
     <w:uiPriority w:val="9"/>
     <w:semiHidden/>
     <w:unhideWhenUsed/>
@@ -1743,13 +2587,13 @@
       <w14:ligatures w14:val="standardContextual"/>
     </w:rPr>
   </w:style>
-  <w:style w:type="character" w:default="1" w:styleId="DefaultParagraphFont">
+  <w:style w:type="character" w:default="1" w:styleId="a0">
     <w:name w:val="Default Paragraph Font"/>
     <w:uiPriority w:val="1"/>
     <w:semiHidden/>
     <w:unhideWhenUsed/>
   </w:style>
-  <w:style w:type="table" w:default="1" w:styleId="TableNormal">
+  <w:style w:type="table" w:default="1" w:styleId="a1">
     <w:name w:val="Normal Table"/>
     <w:uiPriority w:val="99"/>
     <w:semiHidden/>
@@ -1764,16 +2608,16 @@
       </w:tblCellMar>
     </w:tblPr>
   </w:style>
-  <w:style w:type="numbering" w:default="1" w:styleId="NoList">
+  <w:style w:type="numbering" w:default="1" w:styleId="a2">
     <w:name w:val="No List"/>
     <w:uiPriority w:val="99"/>
     <w:semiHidden/>
     <w:unhideWhenUsed/>
   </w:style>
-  <w:style w:type="character" w:customStyle="1" w:styleId="Heading1Char">
-    <w:name w:val="Heading 1 Char"/>
-    <w:basedOn w:val="DefaultParagraphFont"/>
-    <w:link w:val="Heading1"/>
+  <w:style w:type="character" w:customStyle="1" w:styleId="10">
+    <w:name w:val="หัวเรื่อง 1 อักขระ"/>
+    <w:basedOn w:val="a0"/>
+    <w:link w:val="1"/>
     <w:uiPriority w:val="9"/>
     <w:rsid w:val="00824612"/>
     <w:rPr>
@@ -1783,10 +2627,10 @@
       <w:szCs w:val="50"/>
     </w:rPr>
   </w:style>
-  <w:style w:type="character" w:customStyle="1" w:styleId="Heading2Char">
-    <w:name w:val="Heading 2 Char"/>
-    <w:basedOn w:val="DefaultParagraphFont"/>
-    <w:link w:val="Heading2"/>
+  <w:style w:type="character" w:customStyle="1" w:styleId="20">
+    <w:name w:val="หัวเรื่อง 2 อักขระ"/>
+    <w:basedOn w:val="a0"/>
+    <w:link w:val="2"/>
     <w:uiPriority w:val="9"/>
     <w:semiHidden/>
     <w:rsid w:val="00824612"/>
@@ -1797,10 +2641,10 @@
       <w:szCs w:val="40"/>
     </w:rPr>
   </w:style>
-  <w:style w:type="character" w:customStyle="1" w:styleId="Heading3Char">
-    <w:name w:val="Heading 3 Char"/>
-    <w:basedOn w:val="DefaultParagraphFont"/>
-    <w:link w:val="Heading3"/>
+  <w:style w:type="character" w:customStyle="1" w:styleId="30">
+    <w:name w:val="หัวเรื่อง 3 อักขระ"/>
+    <w:basedOn w:val="a0"/>
+    <w:link w:val="3"/>
     <w:uiPriority w:val="9"/>
     <w:semiHidden/>
     <w:rsid w:val="00824612"/>
@@ -1811,10 +2655,10 @@
       <w:szCs w:val="35"/>
     </w:rPr>
   </w:style>
-  <w:style w:type="character" w:customStyle="1" w:styleId="Heading4Char">
-    <w:name w:val="Heading 4 Char"/>
-    <w:basedOn w:val="DefaultParagraphFont"/>
-    <w:link w:val="Heading4"/>
+  <w:style w:type="character" w:customStyle="1" w:styleId="40">
+    <w:name w:val="หัวเรื่อง 4 อักขระ"/>
+    <w:basedOn w:val="a0"/>
+    <w:link w:val="4"/>
     <w:uiPriority w:val="9"/>
     <w:semiHidden/>
     <w:rsid w:val="00824612"/>
@@ -1825,10 +2669,10 @@
       <w:color w:val="2F5496" w:themeColor="accent1" w:themeShade="BF"/>
     </w:rPr>
   </w:style>
-  <w:style w:type="character" w:customStyle="1" w:styleId="Heading5Char">
-    <w:name w:val="Heading 5 Char"/>
-    <w:basedOn w:val="DefaultParagraphFont"/>
-    <w:link w:val="Heading5"/>
+  <w:style w:type="character" w:customStyle="1" w:styleId="50">
+    <w:name w:val="หัวเรื่อง 5 อักขระ"/>
+    <w:basedOn w:val="a0"/>
+    <w:link w:val="5"/>
     <w:uiPriority w:val="9"/>
     <w:semiHidden/>
     <w:rsid w:val="00824612"/>
@@ -1837,10 +2681,10 @@
       <w:color w:val="2F5496" w:themeColor="accent1" w:themeShade="BF"/>
     </w:rPr>
   </w:style>
-  <w:style w:type="character" w:customStyle="1" w:styleId="Heading6Char">
-    <w:name w:val="Heading 6 Char"/>
-    <w:basedOn w:val="DefaultParagraphFont"/>
-    <w:link w:val="Heading6"/>
+  <w:style w:type="character" w:customStyle="1" w:styleId="60">
+    <w:name w:val="หัวเรื่อง 6 อักขระ"/>
+    <w:basedOn w:val="a0"/>
+    <w:link w:val="6"/>
     <w:uiPriority w:val="9"/>
     <w:semiHidden/>
     <w:rsid w:val="00824612"/>
@@ -1851,10 +2695,10 @@
       <w:color w:val="595959" w:themeColor="text1" w:themeTint="A6"/>
     </w:rPr>
   </w:style>
-  <w:style w:type="character" w:customStyle="1" w:styleId="Heading7Char">
-    <w:name w:val="Heading 7 Char"/>
-    <w:basedOn w:val="DefaultParagraphFont"/>
-    <w:link w:val="Heading7"/>
+  <w:style w:type="character" w:customStyle="1" w:styleId="70">
+    <w:name w:val="หัวเรื่อง 7 อักขระ"/>
+    <w:basedOn w:val="a0"/>
+    <w:link w:val="7"/>
     <w:uiPriority w:val="9"/>
     <w:semiHidden/>
     <w:rsid w:val="00824612"/>
@@ -1863,10 +2707,10 @@
       <w:color w:val="595959" w:themeColor="text1" w:themeTint="A6"/>
     </w:rPr>
   </w:style>
-  <w:style w:type="character" w:customStyle="1" w:styleId="Heading8Char">
-    <w:name w:val="Heading 8 Char"/>
-    <w:basedOn w:val="DefaultParagraphFont"/>
-    <w:link w:val="Heading8"/>
+  <w:style w:type="character" w:customStyle="1" w:styleId="80">
+    <w:name w:val="หัวเรื่อง 8 อักขระ"/>
+    <w:basedOn w:val="a0"/>
+    <w:link w:val="8"/>
     <w:uiPriority w:val="9"/>
     <w:semiHidden/>
     <w:rsid w:val="00824612"/>
@@ -1877,10 +2721,10 @@
       <w:color w:val="272727" w:themeColor="text1" w:themeTint="D8"/>
     </w:rPr>
   </w:style>
-  <w:style w:type="character" w:customStyle="1" w:styleId="Heading9Char">
-    <w:name w:val="Heading 9 Char"/>
-    <w:basedOn w:val="DefaultParagraphFont"/>
-    <w:link w:val="Heading9"/>
+  <w:style w:type="character" w:customStyle="1" w:styleId="90">
+    <w:name w:val="หัวเรื่อง 9 อักขระ"/>
+    <w:basedOn w:val="a0"/>
+    <w:link w:val="9"/>
     <w:uiPriority w:val="9"/>
     <w:semiHidden/>
     <w:rsid w:val="00824612"/>
@@ -1889,11 +2733,11 @@
       <w:color w:val="272727" w:themeColor="text1" w:themeTint="D8"/>
     </w:rPr>
   </w:style>
-  <w:style w:type="paragraph" w:styleId="Title">
+  <w:style w:type="paragraph" w:styleId="a3">
     <w:name w:val="Title"/>
-    <w:basedOn w:val="Normal"/>
-    <w:next w:val="Normal"/>
-    <w:link w:val="TitleChar"/>
+    <w:basedOn w:val="a"/>
+    <w:next w:val="a"/>
+    <w:link w:val="a4"/>
     <w:uiPriority w:val="10"/>
     <w:qFormat/>
     <w:rsid w:val="00824612"/>
@@ -1911,10 +2755,10 @@
       <w14:ligatures w14:val="standardContextual"/>
     </w:rPr>
   </w:style>
-  <w:style w:type="character" w:customStyle="1" w:styleId="TitleChar">
-    <w:name w:val="Title Char"/>
-    <w:basedOn w:val="DefaultParagraphFont"/>
-    <w:link w:val="Title"/>
+  <w:style w:type="character" w:customStyle="1" w:styleId="a4">
+    <w:name w:val="ชื่อเรื่อง อักขระ"/>
+    <w:basedOn w:val="a0"/>
+    <w:link w:val="a3"/>
     <w:uiPriority w:val="10"/>
     <w:rsid w:val="00824612"/>
     <w:rPr>
@@ -1925,11 +2769,11 @@
       <w:szCs w:val="71"/>
     </w:rPr>
   </w:style>
-  <w:style w:type="paragraph" w:styleId="Subtitle">
+  <w:style w:type="paragraph" w:styleId="a5">
     <w:name w:val="Subtitle"/>
-    <w:basedOn w:val="Normal"/>
-    <w:next w:val="Normal"/>
-    <w:link w:val="SubtitleChar"/>
+    <w:basedOn w:val="a"/>
+    <w:next w:val="a"/>
+    <w:link w:val="a6"/>
     <w:uiPriority w:val="11"/>
     <w:qFormat/>
     <w:rsid w:val="00824612"/>
@@ -1950,10 +2794,10 @@
       <w14:ligatures w14:val="standardContextual"/>
     </w:rPr>
   </w:style>
-  <w:style w:type="character" w:customStyle="1" w:styleId="SubtitleChar">
-    <w:name w:val="Subtitle Char"/>
-    <w:basedOn w:val="DefaultParagraphFont"/>
-    <w:link w:val="Subtitle"/>
+  <w:style w:type="character" w:customStyle="1" w:styleId="a6">
+    <w:name w:val="ชื่อเรื่องรอง อักขระ"/>
+    <w:basedOn w:val="a0"/>
+    <w:link w:val="a5"/>
     <w:uiPriority w:val="11"/>
     <w:rsid w:val="00824612"/>
     <w:rPr>
@@ -1964,11 +2808,11 @@
       <w:szCs w:val="35"/>
     </w:rPr>
   </w:style>
-  <w:style w:type="paragraph" w:styleId="Quote">
+  <w:style w:type="paragraph" w:styleId="a7">
     <w:name w:val="Quote"/>
-    <w:basedOn w:val="Normal"/>
-    <w:next w:val="Normal"/>
-    <w:link w:val="QuoteChar"/>
+    <w:basedOn w:val="a"/>
+    <w:next w:val="a"/>
+    <w:link w:val="a8"/>
     <w:uiPriority w:val="29"/>
     <w:qFormat/>
     <w:rsid w:val="00824612"/>
@@ -1988,10 +2832,10 @@
       <w14:ligatures w14:val="standardContextual"/>
     </w:rPr>
   </w:style>
-  <w:style w:type="character" w:customStyle="1" w:styleId="QuoteChar">
-    <w:name w:val="Quote Char"/>
-    <w:basedOn w:val="DefaultParagraphFont"/>
-    <w:link w:val="Quote"/>
+  <w:style w:type="character" w:customStyle="1" w:styleId="a8">
+    <w:name w:val="คำอ้างอิง อักขระ"/>
+    <w:basedOn w:val="a0"/>
+    <w:link w:val="a7"/>
     <w:uiPriority w:val="29"/>
     <w:rsid w:val="00824612"/>
     <w:rPr>
@@ -2000,9 +2844,9 @@
       <w:color w:val="404040" w:themeColor="text1" w:themeTint="BF"/>
     </w:rPr>
   </w:style>
-  <w:style w:type="paragraph" w:styleId="ListParagraph">
+  <w:style w:type="paragraph" w:styleId="a9">
     <w:name w:val="List Paragraph"/>
-    <w:basedOn w:val="Normal"/>
+    <w:basedOn w:val="a"/>
     <w:uiPriority w:val="34"/>
     <w:qFormat/>
     <w:rsid w:val="00824612"/>
@@ -2020,9 +2864,9 @@
       <w14:ligatures w14:val="standardContextual"/>
     </w:rPr>
   </w:style>
-  <w:style w:type="character" w:styleId="IntenseEmphasis">
+  <w:style w:type="character" w:styleId="aa">
     <w:name w:val="Intense Emphasis"/>
-    <w:basedOn w:val="DefaultParagraphFont"/>
+    <w:basedOn w:val="a0"/>
     <w:uiPriority w:val="21"/>
     <w:qFormat/>
     <w:rsid w:val="00824612"/>
@@ -2032,11 +2876,11 @@
       <w:color w:val="2F5496" w:themeColor="accent1" w:themeShade="BF"/>
     </w:rPr>
   </w:style>
-  <w:style w:type="paragraph" w:styleId="IntenseQuote">
+  <w:style w:type="paragraph" w:styleId="ab">
     <w:name w:val="Intense Quote"/>
-    <w:basedOn w:val="Normal"/>
-    <w:next w:val="Normal"/>
-    <w:link w:val="IntenseQuoteChar"/>
+    <w:basedOn w:val="a"/>
+    <w:next w:val="a"/>
+    <w:link w:val="ac"/>
     <w:uiPriority w:val="30"/>
     <w:qFormat/>
     <w:rsid w:val="00824612"/>
@@ -2061,10 +2905,10 @@
       <w14:ligatures w14:val="standardContextual"/>
     </w:rPr>
   </w:style>
-  <w:style w:type="character" w:customStyle="1" w:styleId="IntenseQuoteChar">
-    <w:name w:val="Intense Quote Char"/>
-    <w:basedOn w:val="DefaultParagraphFont"/>
-    <w:link w:val="IntenseQuote"/>
+  <w:style w:type="character" w:customStyle="1" w:styleId="ac">
+    <w:name w:val="ทำให้คำอ้างอิงเป็นสีเข้มขึ้น อักขระ"/>
+    <w:basedOn w:val="a0"/>
+    <w:link w:val="ab"/>
     <w:uiPriority w:val="30"/>
     <w:rsid w:val="00824612"/>
     <w:rPr>
@@ -2073,9 +2917,9 @@
       <w:color w:val="2F5496" w:themeColor="accent1" w:themeShade="BF"/>
     </w:rPr>
   </w:style>
-  <w:style w:type="character" w:styleId="IntenseReference">
+  <w:style w:type="character" w:styleId="ad">
     <w:name w:val="Intense Reference"/>
-    <w:basedOn w:val="DefaultParagraphFont"/>
+    <w:basedOn w:val="a0"/>
     <w:uiPriority w:val="32"/>
     <w:qFormat/>
     <w:rsid w:val="00824612"/>
@@ -2087,9 +2931,9 @@
       <w:spacing w:val="5"/>
     </w:rPr>
   </w:style>
-  <w:style w:type="table" w:styleId="TableGrid">
+  <w:style w:type="table" w:styleId="ae">
     <w:name w:val="Table Grid"/>
-    <w:basedOn w:val="TableNormal"/>
+    <w:basedOn w:val="a1"/>
     <w:uiPriority w:val="39"/>
     <w:rsid w:val="00824612"/>
     <w:pPr>
@@ -2113,10 +2957,10 @@
       </w:tblBorders>
     </w:tblPr>
   </w:style>
-  <w:style w:type="paragraph" w:styleId="Header">
+  <w:style w:type="paragraph" w:styleId="af">
     <w:name w:val="header"/>
-    <w:basedOn w:val="Normal"/>
-    <w:link w:val="HeaderChar"/>
+    <w:basedOn w:val="a"/>
+    <w:link w:val="af0"/>
     <w:uiPriority w:val="99"/>
     <w:unhideWhenUsed/>
     <w:rsid w:val="00824612"/>
@@ -2131,10 +2975,10 @@
       <w:szCs w:val="30"/>
     </w:rPr>
   </w:style>
-  <w:style w:type="character" w:customStyle="1" w:styleId="HeaderChar">
-    <w:name w:val="Header Char"/>
-    <w:basedOn w:val="DefaultParagraphFont"/>
-    <w:link w:val="Header"/>
+  <w:style w:type="character" w:customStyle="1" w:styleId="af0">
+    <w:name w:val="หัวกระดาษ อักขระ"/>
+    <w:basedOn w:val="a0"/>
+    <w:link w:val="af"/>
     <w:uiPriority w:val="99"/>
     <w:rsid w:val="00824612"/>
     <w:rPr>
@@ -2146,10 +2990,10 @@
       <w14:ligatures w14:val="none"/>
     </w:rPr>
   </w:style>
-  <w:style w:type="paragraph" w:styleId="Footer">
+  <w:style w:type="paragraph" w:styleId="af1">
     <w:name w:val="footer"/>
-    <w:basedOn w:val="Normal"/>
-    <w:link w:val="FooterChar"/>
+    <w:basedOn w:val="a"/>
+    <w:link w:val="af2"/>
     <w:uiPriority w:val="99"/>
     <w:unhideWhenUsed/>
     <w:rsid w:val="00824612"/>
@@ -2164,10 +3008,10 @@
       <w:szCs w:val="30"/>
     </w:rPr>
   </w:style>
-  <w:style w:type="character" w:customStyle="1" w:styleId="FooterChar">
-    <w:name w:val="Footer Char"/>
-    <w:basedOn w:val="DefaultParagraphFont"/>
-    <w:link w:val="Footer"/>
+  <w:style w:type="character" w:customStyle="1" w:styleId="af2">
+    <w:name w:val="ท้ายกระดาษ อักขระ"/>
+    <w:basedOn w:val="a0"/>
+    <w:link w:val="af1"/>
     <w:uiPriority w:val="99"/>
     <w:rsid w:val="00824612"/>
     <w:rPr>

</xml_diff>